<commit_message>
Update Database Views Audit Table Spec Doc - Template.docx
</commit_message>
<xml_diff>
--- a/Database Views Audit Table Spec Doc - Template.docx
+++ b/Database Views Audit Table Spec Doc - Template.docx
@@ -1741,10 +1741,15 @@
             <w:pPr>
               <w:pStyle w:val="Compact"/>
             </w:pPr>
+            <w:proofErr w:type="spellStart"/>
             <w:r>
+              <w:rPr>
+                <w:lang w:val="en-GB"/>
+              </w:rPr>
               <w:lastRenderedPageBreak/>
-              <w:t>ns2_transactions_vw</w:t>
+              <w:t>employee_summary_vw</w:t>
             </w:r>
+            <w:proofErr w:type="spellEnd"/>
           </w:p>
         </w:tc>
         <w:tc>
@@ -1790,12 +1795,48 @@
               </w:rPr>
               <w:t>].[</w:t>
             </w:r>
+            <w:proofErr w:type="spellStart"/>
             <w:proofErr w:type="gramEnd"/>
             <w:r>
               <w:rPr>
                 <w:lang w:val="en-GB"/>
               </w:rPr>
-              <w:t xml:space="preserve">ns2_transactions_vw] AS SELECT ... FROM ns2_transactions ... WHERE </w:t>
+              <w:t>employee_summary_vw</w:t>
+            </w:r>
+            <w:proofErr w:type="spellEnd"/>
+            <w:r>
+              <w:rPr>
+                <w:lang w:val="en-GB"/>
+              </w:rPr>
+              <w:t xml:space="preserve">] AS SELECT </w:t>
+            </w:r>
+            <w:proofErr w:type="spellStart"/>
+            <w:r>
+              <w:rPr>
+                <w:lang w:val="en-GB"/>
+              </w:rPr>
+              <w:t>employee_id</w:t>
+            </w:r>
+            <w:proofErr w:type="spellEnd"/>
+            <w:r>
+              <w:rPr>
+                <w:lang w:val="en-GB"/>
+              </w:rPr>
+              <w:t xml:space="preserve">, department, </w:t>
+            </w:r>
+            <w:proofErr w:type="spellStart"/>
+            <w:r>
+              <w:rPr>
+                <w:lang w:val="en-GB"/>
+              </w:rPr>
+              <w:t>hire_date</w:t>
+            </w:r>
+            <w:proofErr w:type="spellEnd"/>
+            <w:r>
+              <w:rPr>
+                <w:lang w:val="en-GB"/>
+              </w:rPr>
+              <w:t xml:space="preserve"> FROM </w:t>
             </w:r>
             <w:proofErr w:type="spellStart"/>
             <w:proofErr w:type="gramStart"/>
@@ -1803,7 +1844,7 @@
               <w:rPr>
                 <w:lang w:val="en-GB"/>
               </w:rPr>
-              <w:t>t.postingperiod</w:t>
+              <w:t>dbo.employees</w:t>
             </w:r>
             <w:proofErr w:type="spellEnd"/>
             <w:proofErr w:type="gramEnd"/>
@@ -1811,7 +1852,21 @@
               <w:rPr>
                 <w:lang w:val="en-GB"/>
               </w:rPr>
-              <w:t xml:space="preserve"> &gt;= 207;</w:t>
+              <w:t xml:space="preserve"> WHERE </w:t>
+            </w:r>
+            <w:proofErr w:type="spellStart"/>
+            <w:r>
+              <w:rPr>
+                <w:lang w:val="en-GB"/>
+              </w:rPr>
+              <w:t>employment_status</w:t>
+            </w:r>
+            <w:proofErr w:type="spellEnd"/>
+            <w:r>
+              <w:rPr>
+                <w:lang w:val="en-GB"/>
+              </w:rPr>
+              <w:t xml:space="preserve"> = 'Active';</w:t>
             </w:r>
           </w:p>
         </w:tc>
@@ -1866,9 +1921,14 @@
             <w:pPr>
               <w:pStyle w:val="Compact"/>
             </w:pPr>
+            <w:proofErr w:type="spellStart"/>
             <w:r>
-              <w:t>ns2_transactions_vw</w:t>
+              <w:rPr>
+                <w:lang w:val="en-GB"/>
+              </w:rPr>
+              <w:t>employee_summary_vw</w:t>
             </w:r>
+            <w:proofErr w:type="spellEnd"/>
           </w:p>
         </w:tc>
         <w:tc>
@@ -1907,35 +1967,95 @@
               <w:t>dbo</w:t>
             </w:r>
             <w:proofErr w:type="spellEnd"/>
-            <w:proofErr w:type="gramStart"/>
             <w:r>
               <w:rPr>
                 <w:lang w:val="en-GB"/>
               </w:rPr>
               <w:t>].[</w:t>
             </w:r>
-            <w:proofErr w:type="gramEnd"/>
+            <w:proofErr w:type="spellStart"/>
             <w:r>
               <w:rPr>
                 <w:lang w:val="en-GB"/>
               </w:rPr>
-              <w:t xml:space="preserve">ns2_transactions_vw] AS SELECT ... FROM ns2_transactions ... WHERE </w:t>
+              <w:t>employee_summary_vw</w:t>
             </w:r>
-            <w:proofErr w:type="spellStart"/>
-            <w:proofErr w:type="gramStart"/>
+            <w:proofErr w:type="spellEnd"/>
             <w:r>
               <w:rPr>
                 <w:lang w:val="en-GB"/>
               </w:rPr>
-              <w:t>t.postingperiod</w:t>
+              <w:t xml:space="preserve">] AS SELECT </w:t>
             </w:r>
-            <w:proofErr w:type="spellEnd"/>
-            <w:proofErr w:type="gramEnd"/>
+            <w:proofErr w:type="spellStart"/>
             <w:r>
               <w:rPr>
                 <w:lang w:val="en-GB"/>
               </w:rPr>
-              <w:t xml:space="preserve"> &gt;= 208;</w:t>
+              <w:t>employee_id</w:t>
+            </w:r>
+            <w:proofErr w:type="spellEnd"/>
+            <w:r>
+              <w:rPr>
+                <w:lang w:val="en-GB"/>
+              </w:rPr>
+              <w:t xml:space="preserve">, department, </w:t>
+            </w:r>
+            <w:proofErr w:type="spellStart"/>
+            <w:r>
+              <w:rPr>
+                <w:lang w:val="en-GB"/>
+              </w:rPr>
+              <w:t>hire_date</w:t>
+            </w:r>
+            <w:proofErr w:type="spellEnd"/>
+            <w:r>
+              <w:rPr>
+                <w:lang w:val="en-GB"/>
+              </w:rPr>
+              <w:t xml:space="preserve">, </w:t>
+            </w:r>
+            <w:proofErr w:type="spellStart"/>
+            <w:r>
+              <w:rPr>
+                <w:lang w:val="en-GB"/>
+              </w:rPr>
+              <w:t>employee_status</w:t>
+            </w:r>
+            <w:proofErr w:type="spellEnd"/>
+            <w:r>
+              <w:rPr>
+                <w:lang w:val="en-GB"/>
+              </w:rPr>
+              <w:t xml:space="preserve"> FROM </w:t>
+            </w:r>
+            <w:proofErr w:type="spellStart"/>
+            <w:r>
+              <w:rPr>
+                <w:lang w:val="en-GB"/>
+              </w:rPr>
+              <w:t>dbo.employees</w:t>
+            </w:r>
+            <w:proofErr w:type="spellEnd"/>
+            <w:r>
+              <w:rPr>
+                <w:lang w:val="en-GB"/>
+              </w:rPr>
+              <w:t xml:space="preserve"> WHERE </w:t>
+            </w:r>
+            <w:proofErr w:type="spellStart"/>
+            <w:r>
+              <w:rPr>
+                <w:lang w:val="en-GB"/>
+              </w:rPr>
+              <w:t>employment_status</w:t>
+            </w:r>
+            <w:proofErr w:type="spellEnd"/>
+            <w:r>
+              <w:rPr>
+                <w:lang w:val="en-GB"/>
+              </w:rPr>
+              <w:t xml:space="preserve"> = 'Active';</w:t>
             </w:r>
           </w:p>
         </w:tc>
@@ -2221,6 +2341,7 @@
           <w:szCs w:val="26"/>
           <w:lang w:val="en-ZA"/>
         </w:rPr>
+        <w:lastRenderedPageBreak/>
         <w:t>Logic Overview</w:t>
       </w:r>
       <w:r>
@@ -2293,7 +2414,6 @@
         </w:numPr>
       </w:pPr>
       <w:r>
-        <w:lastRenderedPageBreak/>
         <w:t xml:space="preserve">The view does not already exist in the audit table. </w:t>
       </w:r>
     </w:p>
@@ -4870,7 +4990,6 @@
   <w:style w:type="character" w:default="1" w:styleId="DefaultParagraphFont">
     <w:name w:val="Default Paragraph Font"/>
     <w:uiPriority w:val="1"/>
-    <w:semiHidden/>
     <w:unhideWhenUsed/>
   </w:style>
   <w:style w:type="table" w:default="1" w:styleId="TableNormal">
@@ -7182,31 +7301,10 @@
 </file>
 
 <file path=customXml/item1.xml><?xml version="1.0" encoding="utf-8"?>
-<p:properties xmlns:p="http://schemas.microsoft.com/office/2006/metadata/properties" xmlns:xsi="http://www.w3.org/2001/XMLSchema-instance" xmlns:pc="http://schemas.microsoft.com/office/infopath/2007/PartnerControls">
-  <documentManagement>
-    <TaxCatchAll xmlns="4b4f7290-3361-41d4-b1da-8444c804b724" xsi:nil="true"/>
-    <_ip_UnifiedCompliancePolicyUIAction xmlns="http://schemas.microsoft.com/sharepoint/v3" xsi:nil="true"/>
-    <Alert xmlns="53565a08-e8d3-4305-a920-ea55b298d310" xsi:nil="true"/>
-    <lcf76f155ced4ddcb4097134ff3c332f xmlns="53565a08-e8d3-4305-a920-ea55b298d310">
-      <Terms xmlns="http://schemas.microsoft.com/office/infopath/2007/PartnerControls"/>
-    </lcf76f155ced4ddcb4097134ff3c332f>
-    <Comments xmlns="53565a08-e8d3-4305-a920-ea55b298d310" xsi:nil="true"/>
-    <_ip_UnifiedCompliancePolicyProperties xmlns="http://schemas.microsoft.com/sharepoint/v3" xsi:nil="true"/>
-    <_Flow_SignoffStatus xmlns="53565a08-e8d3-4305-a920-ea55b298d310" xsi:nil="true"/>
-  </documentManagement>
-</p:properties>
+<b:Sources xmlns:b="http://schemas.openxmlformats.org/officeDocument/2006/bibliography" xmlns="http://schemas.openxmlformats.org/officeDocument/2006/bibliography" SelectedStyle="/APASixthEditionOfficeOnline.xsl" StyleName="APA" Version="6"/>
 </file>
 
 <file path=customXml/item2.xml><?xml version="1.0" encoding="utf-8"?>
-<?mso-contentType ?>
-<FormTemplates xmlns="http://schemas.microsoft.com/sharepoint/v3/contenttype/forms">
-  <Display>DocumentLibraryForm</Display>
-  <Edit>DocumentLibraryForm</Edit>
-  <New>DocumentLibraryForm</New>
-</FormTemplates>
-</file>
-
-<file path=customXml/item3.xml><?xml version="1.0" encoding="utf-8"?>
 <ct:contentTypeSchema xmlns:ct="http://schemas.microsoft.com/office/2006/metadata/contentType" xmlns:ma="http://schemas.microsoft.com/office/2006/metadata/properties/metaAttributes" ct:_="" ma:_="" ma:contentTypeName="Document" ma:contentTypeID="0x010100B0F4415B29D5A348B8CD1942B74D6819" ma:contentTypeVersion="18" ma:contentTypeDescription="Create a new document." ma:contentTypeScope="" ma:versionID="ba5f7c950e739d55e9aad35251204538">
   <xsd:schema xmlns:xsd="http://www.w3.org/2001/XMLSchema" xmlns:xs="http://www.w3.org/2001/XMLSchema" xmlns:p="http://schemas.microsoft.com/office/2006/metadata/properties" xmlns:ns1="http://schemas.microsoft.com/sharepoint/v3" xmlns:ns2="53565a08-e8d3-4305-a920-ea55b298d310" xmlns:ns3="4b4f7290-3361-41d4-b1da-8444c804b724" targetNamespace="http://schemas.microsoft.com/office/2006/metadata/properties" ma:root="true" ma:fieldsID="e92dbf6a00d2b0e37403a41950bbbce9" ns1:_="" ns2:_="" ns3:_="">
     <xsd:import namespace="http://schemas.microsoft.com/sharepoint/v3"/>
@@ -7452,31 +7550,40 @@
 </ct:contentTypeSchema>
 </file>
 
+<file path=customXml/item3.xml><?xml version="1.0" encoding="utf-8"?>
+<?mso-contentType ?>
+<FormTemplates xmlns="http://schemas.microsoft.com/sharepoint/v3/contenttype/forms">
+  <Display>DocumentLibraryForm</Display>
+  <Edit>DocumentLibraryForm</Edit>
+  <New>DocumentLibraryForm</New>
+</FormTemplates>
+</file>
+
 <file path=customXml/item4.xml><?xml version="1.0" encoding="utf-8"?>
-<b:Sources xmlns:b="http://schemas.openxmlformats.org/officeDocument/2006/bibliography" xmlns="http://schemas.openxmlformats.org/officeDocument/2006/bibliography" SelectedStyle="/APASixthEditionOfficeOnline.xsl" StyleName="APA" Version="6"/>
+<p:properties xmlns:p="http://schemas.microsoft.com/office/2006/metadata/properties" xmlns:xsi="http://www.w3.org/2001/XMLSchema-instance" xmlns:pc="http://schemas.microsoft.com/office/infopath/2007/PartnerControls">
+  <documentManagement>
+    <TaxCatchAll xmlns="4b4f7290-3361-41d4-b1da-8444c804b724" xsi:nil="true"/>
+    <_ip_UnifiedCompliancePolicyUIAction xmlns="http://schemas.microsoft.com/sharepoint/v3" xsi:nil="true"/>
+    <Alert xmlns="53565a08-e8d3-4305-a920-ea55b298d310" xsi:nil="true"/>
+    <lcf76f155ced4ddcb4097134ff3c332f xmlns="53565a08-e8d3-4305-a920-ea55b298d310">
+      <Terms xmlns="http://schemas.microsoft.com/office/infopath/2007/PartnerControls"/>
+    </lcf76f155ced4ddcb4097134ff3c332f>
+    <Comments xmlns="53565a08-e8d3-4305-a920-ea55b298d310" xsi:nil="true"/>
+    <_ip_UnifiedCompliancePolicyProperties xmlns="http://schemas.microsoft.com/sharepoint/v3" xsi:nil="true"/>
+    <_Flow_SignoffStatus xmlns="53565a08-e8d3-4305-a920-ea55b298d310" xsi:nil="true"/>
+  </documentManagement>
+</p:properties>
 </file>
 
 <file path=customXml/itemProps1.xml><?xml version="1.0" encoding="utf-8"?>
-<ds:datastoreItem xmlns:ds="http://schemas.openxmlformats.org/officeDocument/2006/customXml" ds:itemID="{4E55B138-8965-4B43-907A-88CA6E8C4D3A}">
+<ds:datastoreItem xmlns:ds="http://schemas.openxmlformats.org/officeDocument/2006/customXml" ds:itemID="{101B7B1B-C6B6-8A4E-BC2F-6C3231DCB9F4}">
   <ds:schemaRefs>
-    <ds:schemaRef ds:uri="http://schemas.microsoft.com/office/2006/metadata/properties"/>
-    <ds:schemaRef ds:uri="http://schemas.microsoft.com/office/infopath/2007/PartnerControls"/>
-    <ds:schemaRef ds:uri="4b4f7290-3361-41d4-b1da-8444c804b724"/>
-    <ds:schemaRef ds:uri="http://schemas.microsoft.com/sharepoint/v3"/>
-    <ds:schemaRef ds:uri="53565a08-e8d3-4305-a920-ea55b298d310"/>
+    <ds:schemaRef ds:uri="http://schemas.openxmlformats.org/officeDocument/2006/bibliography"/>
   </ds:schemaRefs>
 </ds:datastoreItem>
 </file>
 
 <file path=customXml/itemProps2.xml><?xml version="1.0" encoding="utf-8"?>
-<ds:datastoreItem xmlns:ds="http://schemas.openxmlformats.org/officeDocument/2006/customXml" ds:itemID="{EE98842F-3835-45F2-B904-1B86C4B80880}">
-  <ds:schemaRefs>
-    <ds:schemaRef ds:uri="http://schemas.microsoft.com/sharepoint/v3/contenttype/forms"/>
-  </ds:schemaRefs>
-</ds:datastoreItem>
-</file>
-
-<file path=customXml/itemProps3.xml><?xml version="1.0" encoding="utf-8"?>
 <ds:datastoreItem xmlns:ds="http://schemas.openxmlformats.org/officeDocument/2006/customXml" ds:itemID="{15C4B23E-7E41-451A-B6D3-B66B9041F82A}">
   <ds:schemaRefs>
     <ds:schemaRef ds:uri="http://schemas.microsoft.com/office/2006/metadata/contentType"/>
@@ -7496,10 +7603,22 @@
 </ds:datastoreItem>
 </file>
 
+<file path=customXml/itemProps3.xml><?xml version="1.0" encoding="utf-8"?>
+<ds:datastoreItem xmlns:ds="http://schemas.openxmlformats.org/officeDocument/2006/customXml" ds:itemID="{EE98842F-3835-45F2-B904-1B86C4B80880}">
+  <ds:schemaRefs>
+    <ds:schemaRef ds:uri="http://schemas.microsoft.com/sharepoint/v3/contenttype/forms"/>
+  </ds:schemaRefs>
+</ds:datastoreItem>
+</file>
+
 <file path=customXml/itemProps4.xml><?xml version="1.0" encoding="utf-8"?>
-<ds:datastoreItem xmlns:ds="http://schemas.openxmlformats.org/officeDocument/2006/customXml" ds:itemID="{101B7B1B-C6B6-8A4E-BC2F-6C3231DCB9F4}">
+<ds:datastoreItem xmlns:ds="http://schemas.openxmlformats.org/officeDocument/2006/customXml" ds:itemID="{4E55B138-8965-4B43-907A-88CA6E8C4D3A}">
   <ds:schemaRefs>
-    <ds:schemaRef ds:uri="http://schemas.openxmlformats.org/officeDocument/2006/bibliography"/>
+    <ds:schemaRef ds:uri="http://schemas.microsoft.com/office/2006/metadata/properties"/>
+    <ds:schemaRef ds:uri="http://schemas.microsoft.com/office/infopath/2007/PartnerControls"/>
+    <ds:schemaRef ds:uri="4b4f7290-3361-41d4-b1da-8444c804b724"/>
+    <ds:schemaRef ds:uri="http://schemas.microsoft.com/sharepoint/v3"/>
+    <ds:schemaRef ds:uri="53565a08-e8d3-4305-a920-ea55b298d310"/>
   </ds:schemaRefs>
 </ds:datastoreItem>
 </file>

</xml_diff>